<commit_message>
Use compactifyTable for tables produced by all readers.
Remove old ad hoc `paraToPlain` at the table cell level.

This should ensure that we don't get tables that mix
Plain and Para. Such tables tend to look funny when
rendered in docx and other formats.

Closes #11864.
</commit_message>
<xml_diff>
--- a/test/docx/golden/table_with_list_cell.docx
+++ b/test/docx/golden/table_with_list_cell.docx
@@ -21,7 +21,7 @@
           <w:tcPr/>
           <w:p>
             <w:pPr>
-              <w:pStyle w:val="Compact"/>
+              <w:pStyle w:val="FirstParagraph"/>
             </w:pPr>
             <w:r>
               <w:t xml:space="preserve">Cell with text</w:t>
@@ -32,7 +32,7 @@
           <w:tcPr/>
           <w:p>
             <w:pPr>
-              <w:pStyle w:val="Compact"/>
+              <w:pStyle w:val="FirstParagraph"/>
             </w:pPr>
             <w:r>
               <w:t xml:space="preserve">Cell with text</w:t>

</xml_diff>